<commit_message>
Song Journey packets: rebuild Watchtower/the-cure from source, dedupe
Last night's power-chords fix (78ec3ad) patched these two packets'
docx XML directly, since the build folder they'd originally come from
was gone. Rebuilt both from an updated song-journey-build/ source
instead (content-watchtower.js / content-the-cure.js now carry the
same both-root-strings TAB the site teaches), so they're regenerable
again and match every other packet's build path. TAB digits verified
against the live site's tabs/*.html.

Also removed "Song Journeys - PDFs.zip" — a duplicate of the 6 PDFs
already sitting individually in this same folder, added by the same
commit. No reason to carry the same bytes twice.

Co-Authored-By: Claude Sonnet 5 <noreply@anthropic.com>
Claude-Session: https://claude.ai/code/session_01HQWYLyygzsEPiUK1hA3bRm
</commit_message>
<xml_diff>
--- a/song journeys for copying/Song Journey - All Along the Watchtower.docx
+++ b/song journeys for copying/Song Journey - All Along the Watchtower.docx
@@ -1034,7 +1034,7 @@
           <w:sz w:val="22"/>
           <w:szCs w:val="22"/>
         </w:rPr>
-        <w:t>Same three roots you played in Layer 2 — each note now also plays the note a fifth above it. A5 takes its root on the open A string; G5 and F5 take theirs on the low E, so the loop crosses both root strings every lap.</w:t>
+        <w:t>Same three roots you played in Layer 2 — each note now also plays the note a fifth above it. G5 and F5 keep their root on the low E string; A5 moves to the open A string, so the loop crosses both root strings every lap.</w:t>
       </w:r>
     </w:p>
     <w:p>
@@ -1054,300 +1054,328 @@
           <w:sz w:val="18"/>
           <w:szCs w:val="18"/>
         </w:rPr>
-        <w:t>Power chords · roots on the A string and the low E · one lap = two bars</w:t>
-      </w:r>
-    </w:p>
-    <w:p>
-      <w:pPr>
-        <w:keepNext/>
-        <w:keepLines/>
-        <w:pBdr>
-          <w:left w:val="single" w:sz="18" w:space="8" w:color="5B3FA6"/>
-        </w:pBdr>
-        <w:ind w:left="120"/>
-      </w:pPr>
-      <w:r>
-        <w:rPr>
-          <w:rFonts w:ascii="Courier New" w:eastAsia="Courier New" w:hAnsi="Courier New" w:cs="Courier New"/>
-          <w:color w:val="222222"/>
-          <w:sz w:val="17"/>
-          <w:szCs w:val="17"/>
-        </w:rPr>
-        <w:t xml:space="preserve">     A5   A5   G5   G5    F5   F5   G5   G5   (loop)</w:t>
-      </w:r>
-    </w:p>
-    <w:p>
-      <w:pPr>
-        <w:keepNext/>
-        <w:keepLines/>
-        <w:pBdr>
-          <w:left w:val="single" w:sz="18" w:space="8" w:color="5B3FA6"/>
-        </w:pBdr>
-        <w:ind w:left="120"/>
-      </w:pPr>
-      <w:r>
-        <w:rPr>
-          <w:rFonts w:ascii="Courier New" w:eastAsia="Courier New" w:hAnsi="Courier New" w:cs="Courier New"/>
-          <w:color w:val="222222"/>
-          <w:sz w:val="17"/>
-          <w:szCs w:val="17"/>
-        </w:rPr>
-        <w:t>e |--------------------|--------------------|</w:t>
-      </w:r>
-    </w:p>
-    <w:p>
-      <w:pPr>
-        <w:keepNext/>
-        <w:keepLines/>
-        <w:pBdr>
-          <w:left w:val="single" w:sz="18" w:space="8" w:color="5B3FA6"/>
-        </w:pBdr>
-        <w:ind w:left="120"/>
-      </w:pPr>
-      <w:r>
-        <w:rPr>
-          <w:rFonts w:ascii="Courier New" w:eastAsia="Courier New" w:hAnsi="Courier New" w:cs="Courier New"/>
-          <w:color w:val="222222"/>
-          <w:sz w:val="17"/>
-          <w:szCs w:val="17"/>
-        </w:rPr>
-        <w:t>B |--------------------|--------------------|</w:t>
-      </w:r>
-    </w:p>
-    <w:p>
-      <w:pPr>
-        <w:keepNext/>
-        <w:keepLines/>
-        <w:pBdr>
-          <w:left w:val="single" w:sz="18" w:space="8" w:color="5B3FA6"/>
-        </w:pBdr>
-        <w:ind w:left="120"/>
-      </w:pPr>
-      <w:r>
-        <w:rPr>
-          <w:rFonts w:ascii="Courier New" w:eastAsia="Courier New" w:hAnsi="Courier New" w:cs="Courier New"/>
-          <w:color w:val="222222"/>
-          <w:sz w:val="17"/>
-          <w:szCs w:val="17"/>
-        </w:rPr>
-        <w:t>G |--------------------|--------------------|</w:t>
-      </w:r>
-    </w:p>
-    <w:p>
-      <w:pPr>
-        <w:keepNext/>
-        <w:keepLines/>
-        <w:pBdr>
-          <w:left w:val="single" w:sz="18" w:space="8" w:color="5B3FA6"/>
-        </w:pBdr>
-        <w:ind w:left="120"/>
-      </w:pPr>
-      <w:r>
-        <w:rPr>
-          <w:rFonts w:ascii="Courier New" w:eastAsia="Courier New" w:hAnsi="Courier New" w:cs="Courier New"/>
-          <w:color w:val="222222"/>
-          <w:sz w:val="17"/>
-          <w:szCs w:val="17"/>
-        </w:rPr>
-        <w:t xml:space="preserve">D |--</w:t>
-      </w:r>
-      <w:r>
-        <w:rPr>
-          <w:rFonts w:ascii="Courier New" w:eastAsia="Courier New" w:hAnsi="Courier New" w:cs="Courier New"/>
-          <w:b/>
-          <w:bCs/>
-          <w:color w:val="5B3FA6"/>
-          <w:sz w:val="17"/>
-          <w:szCs w:val="17"/>
-        </w:rPr>
-        <w:t xml:space="preserve">2</w:t>
-      </w:r>
-      <w:r>
-        <w:rPr>
-          <w:rFonts w:ascii="Courier New" w:eastAsia="Courier New" w:hAnsi="Courier New" w:cs="Courier New"/>
-          <w:color w:val="222222"/>
-          <w:sz w:val="17"/>
-          <w:szCs w:val="17"/>
-        </w:rPr>
-        <w:t xml:space="preserve">----</w:t>
-      </w:r>
-      <w:r>
-        <w:rPr>
-          <w:rFonts w:ascii="Courier New" w:eastAsia="Courier New" w:hAnsi="Courier New" w:cs="Courier New"/>
-          <w:b/>
-          <w:bCs/>
-          <w:color w:val="5B3FA6"/>
-          <w:sz w:val="17"/>
-          <w:szCs w:val="17"/>
-        </w:rPr>
-        <w:t xml:space="preserve">2</w:t>
-      </w:r>
-      <w:r>
-        <w:rPr>
-          <w:rFonts w:ascii="Courier New" w:eastAsia="Courier New" w:hAnsi="Courier New" w:cs="Courier New"/>
-          <w:color w:val="222222"/>
-          <w:sz w:val="17"/>
-          <w:szCs w:val="17"/>
-        </w:rPr>
-        <w:t xml:space="preserve">------------|--------------------|</w:t>
-      </w:r>
-    </w:p>
-    <w:p>
-      <w:pPr>
-        <w:keepNext/>
-        <w:keepLines/>
-        <w:pBdr>
-          <w:left w:val="single" w:sz="18" w:space="8" w:color="5B3FA6"/>
-        </w:pBdr>
-        <w:ind w:left="120"/>
-      </w:pPr>
-      <w:r>
-        <w:rPr>
-          <w:rFonts w:ascii="Courier New" w:eastAsia="Courier New" w:hAnsi="Courier New" w:cs="Courier New"/>
-          <w:color w:val="222222"/>
-          <w:sz w:val="17"/>
-          <w:szCs w:val="17"/>
-        </w:rPr>
-        <w:t xml:space="preserve">A |--0----0----</w:t>
-      </w:r>
-      <w:r>
-        <w:rPr>
-          <w:rFonts w:ascii="Courier New" w:eastAsia="Courier New" w:hAnsi="Courier New" w:cs="Courier New"/>
-          <w:b/>
-          <w:bCs/>
-          <w:color w:val="5B3FA6"/>
-          <w:sz w:val="17"/>
-          <w:szCs w:val="17"/>
-        </w:rPr>
-        <w:t xml:space="preserve">5</w:t>
-      </w:r>
-      <w:r>
-        <w:rPr>
-          <w:rFonts w:ascii="Courier New" w:eastAsia="Courier New" w:hAnsi="Courier New" w:cs="Courier New"/>
-          <w:color w:val="222222"/>
-          <w:sz w:val="17"/>
-          <w:szCs w:val="17"/>
-        </w:rPr>
-        <w:t xml:space="preserve">----</w:t>
-      </w:r>
-      <w:r>
-        <w:rPr>
-          <w:rFonts w:ascii="Courier New" w:eastAsia="Courier New" w:hAnsi="Courier New" w:cs="Courier New"/>
-          <w:b/>
-          <w:bCs/>
-          <w:color w:val="5B3FA6"/>
-          <w:sz w:val="17"/>
-          <w:szCs w:val="17"/>
-        </w:rPr>
-        <w:t xml:space="preserve">5</w:t>
-      </w:r>
-      <w:r>
-        <w:rPr>
-          <w:rFonts w:ascii="Courier New" w:eastAsia="Courier New" w:hAnsi="Courier New" w:cs="Courier New"/>
-          <w:color w:val="222222"/>
-          <w:sz w:val="17"/>
-          <w:szCs w:val="17"/>
-        </w:rPr>
-        <w:t xml:space="preserve">--|--</w:t>
-      </w:r>
-      <w:r>
-        <w:rPr>
-          <w:rFonts w:ascii="Courier New" w:eastAsia="Courier New" w:hAnsi="Courier New" w:cs="Courier New"/>
-          <w:b/>
-          <w:bCs/>
-          <w:color w:val="5B3FA6"/>
-          <w:sz w:val="17"/>
-          <w:szCs w:val="17"/>
-        </w:rPr>
-        <w:t xml:space="preserve">3</w:t>
-      </w:r>
-      <w:r>
-        <w:rPr>
-          <w:rFonts w:ascii="Courier New" w:eastAsia="Courier New" w:hAnsi="Courier New" w:cs="Courier New"/>
-          <w:color w:val="222222"/>
-          <w:sz w:val="17"/>
-          <w:szCs w:val="17"/>
-        </w:rPr>
-        <w:t xml:space="preserve">----</w:t>
-      </w:r>
-      <w:r>
-        <w:rPr>
-          <w:rFonts w:ascii="Courier New" w:eastAsia="Courier New" w:hAnsi="Courier New" w:cs="Courier New"/>
-          <w:b/>
-          <w:bCs/>
-          <w:color w:val="5B3FA6"/>
-          <w:sz w:val="17"/>
-          <w:szCs w:val="17"/>
-        </w:rPr>
-        <w:t xml:space="preserve">3</w:t>
-      </w:r>
-      <w:r>
-        <w:rPr>
-          <w:rFonts w:ascii="Courier New" w:eastAsia="Courier New" w:hAnsi="Courier New" w:cs="Courier New"/>
-          <w:color w:val="222222"/>
-          <w:sz w:val="17"/>
-          <w:szCs w:val="17"/>
-        </w:rPr>
-        <w:t xml:space="preserve">----</w:t>
-      </w:r>
-      <w:r>
-        <w:rPr>
-          <w:rFonts w:ascii="Courier New" w:eastAsia="Courier New" w:hAnsi="Courier New" w:cs="Courier New"/>
-          <w:b/>
-          <w:bCs/>
-          <w:color w:val="5B3FA6"/>
-          <w:sz w:val="17"/>
-          <w:szCs w:val="17"/>
-        </w:rPr>
-        <w:t xml:space="preserve">5</w:t>
-      </w:r>
-      <w:r>
-        <w:rPr>
-          <w:rFonts w:ascii="Courier New" w:eastAsia="Courier New" w:hAnsi="Courier New" w:cs="Courier New"/>
-          <w:color w:val="222222"/>
-          <w:sz w:val="17"/>
-          <w:szCs w:val="17"/>
-        </w:rPr>
-        <w:t xml:space="preserve">----</w:t>
-      </w:r>
-      <w:r>
-        <w:rPr>
-          <w:rFonts w:ascii="Courier New" w:eastAsia="Courier New" w:hAnsi="Courier New" w:cs="Courier New"/>
-          <w:b/>
-          <w:bCs/>
-          <w:color w:val="5B3FA6"/>
-          <w:sz w:val="17"/>
-          <w:szCs w:val="17"/>
-        </w:rPr>
-        <w:t xml:space="preserve">5</w:t>
-      </w:r>
-      <w:r>
-        <w:rPr>
-          <w:rFonts w:ascii="Courier New" w:eastAsia="Courier New" w:hAnsi="Courier New" w:cs="Courier New"/>
-          <w:color w:val="222222"/>
-          <w:sz w:val="17"/>
-          <w:szCs w:val="17"/>
-        </w:rPr>
-        <w:t xml:space="preserve">--|</w:t>
-      </w:r>
-    </w:p>
-    <w:p>
-      <w:pPr>
-        <w:keepNext/>
-        <w:keepLines/>
-        <w:pBdr>
-          <w:left w:val="single" w:sz="18" w:space="8" w:color="5B3FA6"/>
-        </w:pBdr>
-        <w:ind w:left="120"/>
-      </w:pPr>
-      <w:r>
-        <w:rPr>
-          <w:rFonts w:ascii="Courier New" w:eastAsia="Courier New" w:hAnsi="Courier New" w:cs="Courier New"/>
-          <w:color w:val="222222"/>
-          <w:sz w:val="17"/>
-          <w:szCs w:val="17"/>
-        </w:rPr>
-        <w:t xml:space="preserve">E |------------3----3--|--1----1----3----3--|</w:t>
+        <w:t xml:space="preserve">Power chords · roots on low E and A </w:t>
+      </w:r>
+      <w:r>
+        <w:rPr>
+          <w:b/>
+          <w:bCs/>
+          <w:color w:val="5B3FA6"/>
+          <w:sz w:val="18"/>
+          <w:szCs w:val="18"/>
+        </w:rPr>
+        <w:t>· one lap = two bars</w:t>
+      </w:r>
+    </w:p>
+    <w:p>
+      <w:pPr>
+        <w:keepNext/>
+        <w:keepLines/>
+        <w:pBdr>
+          <w:left w:val="single" w:sz="18" w:space="8" w:color="5B3FA6"/>
+        </w:pBdr>
+        <w:ind w:left="120"/>
+      </w:pPr>
+      <w:r>
+        <w:rPr>
+          <w:rFonts w:ascii="Courier New" w:eastAsia="Courier New" w:hAnsi="Courier New" w:cs="Courier New"/>
+          <w:color w:val="222222"/>
+          <w:sz w:val="17"/>
+          <w:szCs w:val="17"/>
+        </w:rPr>
+        <w:t xml:space="preserve">     A5        A5        G5        G5        F5        F5        G5        G5  (loop)</w:t>
+      </w:r>
+    </w:p>
+    <w:p>
+      <w:pPr>
+        <w:keepNext/>
+        <w:keepLines/>
+        <w:pBdr>
+          <w:left w:val="single" w:sz="18" w:space="8" w:color="5B3FA6"/>
+        </w:pBdr>
+        <w:ind w:left="120"/>
+      </w:pPr>
+      <w:r>
+        <w:rPr>
+          <w:rFonts w:ascii="Courier New" w:eastAsia="Courier New" w:hAnsi="Courier New" w:cs="Courier New"/>
+          <w:color w:val="222222"/>
+          <w:sz w:val="17"/>
+          <w:szCs w:val="17"/>
+        </w:rPr>
+        <w:t>e |--------|--------|--------|--------|--------|--------|--------|--------|</w:t>
+      </w:r>
+    </w:p>
+    <w:p>
+      <w:pPr>
+        <w:keepNext/>
+        <w:keepLines/>
+        <w:pBdr>
+          <w:left w:val="single" w:sz="18" w:space="8" w:color="5B3FA6"/>
+        </w:pBdr>
+        <w:ind w:left="120"/>
+      </w:pPr>
+      <w:r>
+        <w:rPr>
+          <w:rFonts w:ascii="Courier New" w:eastAsia="Courier New" w:hAnsi="Courier New" w:cs="Courier New"/>
+          <w:color w:val="222222"/>
+          <w:sz w:val="17"/>
+          <w:szCs w:val="17"/>
+        </w:rPr>
+        <w:t>B |--------|--------|--------|--------|--------|--------|--------|-------</w:t>
+      </w:r>
+      <w:r>
+        <w:rPr>
+          <w:rFonts w:ascii="Courier New" w:eastAsia="Courier New" w:hAnsi="Courier New" w:cs="Courier New"/>
+          <w:color w:val="222222"/>
+          <w:sz w:val="17"/>
+          <w:szCs w:val="17"/>
+        </w:rPr>
+        <w:t>-|</w:t>
+      </w:r>
+    </w:p>
+    <w:p>
+      <w:pPr>
+        <w:keepNext/>
+        <w:keepLines/>
+        <w:pBdr>
+          <w:left w:val="single" w:sz="18" w:space="8" w:color="5B3FA6"/>
+        </w:pBdr>
+        <w:ind w:left="120"/>
+      </w:pPr>
+      <w:r>
+        <w:rPr>
+          <w:rFonts w:ascii="Courier New" w:eastAsia="Courier New" w:hAnsi="Courier New" w:cs="Courier New"/>
+          <w:color w:val="222222"/>
+          <w:sz w:val="17"/>
+          <w:szCs w:val="17"/>
+        </w:rPr>
+        <w:t>G |--------|--------|--------|--------|--------|--------|--------|--------|</w:t>
+      </w:r>
+    </w:p>
+    <w:p>
+      <w:pPr>
+        <w:keepNext/>
+        <w:keepLines/>
+        <w:pBdr>
+          <w:left w:val="single" w:sz="18" w:space="8" w:color="5B3FA6"/>
+        </w:pBdr>
+        <w:ind w:left="120"/>
+      </w:pPr>
+      <w:r>
+        <w:rPr>
+          <w:rFonts w:ascii="Courier New" w:eastAsia="Courier New" w:hAnsi="Courier New" w:cs="Courier New"/>
+          <w:color w:val="222222"/>
+          <w:sz w:val="17"/>
+          <w:szCs w:val="17"/>
+        </w:rPr>
+        <w:t>D |--</w:t>
+      </w:r>
+      <w:r>
+        <w:rPr>
+          <w:rFonts w:ascii="Courier New" w:eastAsia="Courier New" w:hAnsi="Courier New" w:cs="Courier New"/>
+          <w:b/>
+          <w:bCs/>
+          <w:color w:val="5B3FA6"/>
+          <w:sz w:val="17"/>
+          <w:szCs w:val="17"/>
+        </w:rPr>
+        <w:t>2</w:t>
+      </w:r>
+      <w:r>
+        <w:rPr>
+          <w:rFonts w:ascii="Courier New" w:eastAsia="Courier New" w:hAnsi="Courier New" w:cs="Courier New"/>
+          <w:color w:val="222222"/>
+          <w:sz w:val="17"/>
+          <w:szCs w:val="17"/>
+        </w:rPr>
+        <w:t>-----|--</w:t>
+      </w:r>
+      <w:r>
+        <w:rPr>
+          <w:rFonts w:ascii="Courier New" w:eastAsia="Courier New" w:hAnsi="Courier New" w:cs="Courier New"/>
+          <w:b/>
+          <w:bCs/>
+          <w:color w:val="5B3FA6"/>
+          <w:sz w:val="17"/>
+          <w:szCs w:val="17"/>
+        </w:rPr>
+        <w:t>2</w:t>
+      </w:r>
+      <w:r>
+        <w:rPr>
+          <w:rFonts w:ascii="Courier New" w:eastAsia="Courier New" w:hAnsi="Courier New" w:cs="Courier New"/>
+          <w:color w:val="222222"/>
+          <w:sz w:val="17"/>
+          <w:szCs w:val="17"/>
+        </w:rPr>
+        <w:t>-----|--------|--------|--------|--------|--------|--------|</w:t>
+      </w:r>
+    </w:p>
+    <w:p>
+      <w:pPr>
+        <w:keepNext/>
+        <w:keepLines/>
+        <w:pBdr>
+          <w:left w:val="single" w:sz="18" w:space="8" w:color="5B3FA6"/>
+        </w:pBdr>
+        <w:ind w:left="120"/>
+      </w:pPr>
+      <w:r>
+        <w:rPr>
+          <w:rFonts w:ascii="Courier New" w:eastAsia="Courier New" w:hAnsi="Courier New" w:cs="Courier New"/>
+          <w:color w:val="222222"/>
+          <w:sz w:val="17"/>
+          <w:szCs w:val="17"/>
+        </w:rPr>
+        <w:t>A |--0-----|--0-----|--</w:t>
+      </w:r>
+      <w:r>
+        <w:rPr>
+          <w:rFonts w:ascii="Courier New" w:eastAsia="Courier New" w:hAnsi="Courier New" w:cs="Courier New"/>
+          <w:b/>
+          <w:bCs/>
+          <w:color w:val="5B3FA6"/>
+          <w:sz w:val="17"/>
+          <w:szCs w:val="17"/>
+        </w:rPr>
+        <w:t>5</w:t>
+      </w:r>
+      <w:r>
+        <w:rPr>
+          <w:rFonts w:ascii="Courier New" w:eastAsia="Courier New" w:hAnsi="Courier New" w:cs="Courier New"/>
+          <w:color w:val="222222"/>
+          <w:sz w:val="17"/>
+          <w:szCs w:val="17"/>
+        </w:rPr>
+        <w:t>-----|--</w:t>
+      </w:r>
+      <w:r>
+        <w:rPr>
+          <w:rFonts w:ascii="Courier New" w:eastAsia="Courier New" w:hAnsi="Courier New" w:cs="Courier New"/>
+          <w:b/>
+          <w:bCs/>
+          <w:color w:val="5B3FA6"/>
+          <w:sz w:val="17"/>
+          <w:szCs w:val="17"/>
+        </w:rPr>
+        <w:t>5</w:t>
+      </w:r>
+      <w:r>
+        <w:rPr>
+          <w:rFonts w:ascii="Courier New" w:eastAsia="Courier New" w:hAnsi="Courier New" w:cs="Courier New"/>
+          <w:color w:val="222222"/>
+          <w:sz w:val="17"/>
+          <w:szCs w:val="17"/>
+        </w:rPr>
+        <w:t>-----|--</w:t>
+      </w:r>
+      <w:r>
+        <w:rPr>
+          <w:rFonts w:ascii="Courier New" w:eastAsia="Courier New" w:hAnsi="Courier New" w:cs="Courier New"/>
+          <w:b/>
+          <w:bCs/>
+          <w:color w:val="5B3FA6"/>
+          <w:sz w:val="17"/>
+          <w:szCs w:val="17"/>
+        </w:rPr>
+        <w:t>3</w:t>
+      </w:r>
+      <w:r>
+        <w:rPr>
+          <w:rFonts w:ascii="Courier New" w:eastAsia="Courier New" w:hAnsi="Courier New" w:cs="Courier New"/>
+          <w:color w:val="222222"/>
+          <w:sz w:val="17"/>
+          <w:szCs w:val="17"/>
+        </w:rPr>
+        <w:t>-----|--</w:t>
+      </w:r>
+      <w:r>
+        <w:rPr>
+          <w:rFonts w:ascii="Courier New" w:eastAsia="Courier New" w:hAnsi="Courier New" w:cs="Courier New"/>
+          <w:b/>
+          <w:bCs/>
+          <w:color w:val="5B3FA6"/>
+          <w:sz w:val="17"/>
+          <w:szCs w:val="17"/>
+        </w:rPr>
+        <w:t>3</w:t>
+      </w:r>
+      <w:r>
+        <w:rPr>
+          <w:rFonts w:ascii="Courier New" w:eastAsia="Courier New" w:hAnsi="Courier New" w:cs="Courier New"/>
+          <w:color w:val="222222"/>
+          <w:sz w:val="17"/>
+          <w:szCs w:val="17"/>
+        </w:rPr>
+        <w:t>-----|--</w:t>
+      </w:r>
+      <w:r>
+        <w:rPr>
+          <w:rFonts w:ascii="Courier New" w:eastAsia="Courier New" w:hAnsi="Courier New" w:cs="Courier New"/>
+          <w:b/>
+          <w:bCs/>
+          <w:color w:val="5B3FA6"/>
+          <w:sz w:val="17"/>
+          <w:szCs w:val="17"/>
+        </w:rPr>
+        <w:t>5</w:t>
+      </w:r>
+      <w:r>
+        <w:rPr>
+          <w:rFonts w:ascii="Courier New" w:eastAsia="Courier New" w:hAnsi="Courier New" w:cs="Courier New"/>
+          <w:color w:val="222222"/>
+          <w:sz w:val="17"/>
+          <w:szCs w:val="17"/>
+        </w:rPr>
+        <w:t>-----|--</w:t>
+      </w:r>
+      <w:r>
+        <w:rPr>
+          <w:rFonts w:ascii="Courier New" w:eastAsia="Courier New" w:hAnsi="Courier New" w:cs="Courier New"/>
+          <w:b/>
+          <w:bCs/>
+          <w:color w:val="5B3FA6"/>
+          <w:sz w:val="17"/>
+          <w:szCs w:val="17"/>
+        </w:rPr>
+        <w:t>5</w:t>
+      </w:r>
+      <w:r>
+        <w:rPr>
+          <w:rFonts w:ascii="Courier New" w:eastAsia="Courier New" w:hAnsi="Courier New" w:cs="Courier New"/>
+          <w:color w:val="222222"/>
+          <w:sz w:val="17"/>
+          <w:szCs w:val="17"/>
+        </w:rPr>
+        <w:t>-----|</w:t>
+      </w:r>
+    </w:p>
+    <w:p>
+      <w:pPr>
+        <w:keepNext/>
+        <w:keepLines/>
+        <w:pBdr>
+          <w:left w:val="single" w:sz="18" w:space="8" w:color="5B3FA6"/>
+        </w:pBdr>
+        <w:ind w:left="120"/>
+      </w:pPr>
+      <w:r>
+        <w:rPr>
+          <w:rFonts w:ascii="Courier New" w:eastAsia="Courier New" w:hAnsi="Courier New" w:cs="Courier New"/>
+          <w:color w:val="222222"/>
+          <w:sz w:val="17"/>
+          <w:szCs w:val="17"/>
+        </w:rPr>
+        <w:t>E |--------|--------|--3-</w:t>
+      </w:r>
+      <w:r>
+        <w:rPr>
+          <w:rFonts w:ascii="Courier New" w:eastAsia="Courier New" w:hAnsi="Courier New" w:cs="Courier New"/>
+          <w:color w:val="222222"/>
+          <w:sz w:val="17"/>
+          <w:szCs w:val="17"/>
+        </w:rPr>
+        <w:t>----|--3-----|--1-----|--1-----|--3-----|--3-----|</w:t>
       </w:r>
     </w:p>
     <w:p>
@@ -1414,7 +1442,7 @@
         <w:rPr>
           <w:color w:val="222222"/>
         </w:rPr>
-        <w:t>A5 is one finger on the D string, with the open A ringing under it. Land the whole hand at once.</w:t>
+        <w:t>A5 is one finger on the D string with open A ringing under it. Land the whole hand at once on each change.</w:t>
       </w:r>
     </w:p>
     <w:p>
@@ -1463,7 +1491,13 @@
         <w:rPr>
           <w:color w:val="222222"/>
         </w:rPr>
-        <w:t>Change chords every beat instead of every 2 — same 60 BPM, twice the changes.</w:t>
+        <w:t>Change chords every beat instead of every 2 — same 60 BPM</w:t>
+      </w:r>
+      <w:r>
+        <w:rPr>
+          <w:color w:val="222222"/>
+        </w:rPr>
+        <w:t>, twice the changes.</w:t>
       </w:r>
     </w:p>
     <w:p>
@@ -2888,7 +2922,7 @@
           <w:left w:w="10" w:type="dxa"/>
           <w:right w:w="10" w:type="dxa"/>
         </w:tblCellMar>
-        <w:tblLook w:val="04A0" w:firstRow="1" w:lastRow="0" w:firstColumn="1" w:lastColumn="0" w:noHBand="0" w:noVBand="1"/>
+        <w:tblLook w:val="0000" w:firstRow="0" w:lastRow="0" w:firstColumn="0" w:lastColumn="0" w:noHBand="0" w:noVBand="0"/>
       </w:tblPr>
       <w:tblGrid>
         <w:gridCol w:w="3480"/>
@@ -4773,7 +4807,7 @@
           <w:left w:w="10" w:type="dxa"/>
           <w:right w:w="10" w:type="dxa"/>
         </w:tblCellMar>
-        <w:tblLook w:val="04A0" w:firstRow="1" w:lastRow="0" w:firstColumn="1" w:lastColumn="0" w:noHBand="0" w:noVBand="1"/>
+        <w:tblLook w:val="0000" w:firstRow="0" w:lastRow="0" w:firstColumn="0" w:lastColumn="0" w:noHBand="0" w:noVBand="0"/>
       </w:tblPr>
       <w:tblGrid>
         <w:gridCol w:w="3480"/>
@@ -5884,10 +5918,10 @@
 <file path=word/numbering.xml><?xml version="1.0" encoding="utf-8"?>
 <w:numbering xmlns:wpc="http://schemas.microsoft.com/office/word/2010/wordprocessingCanvas" xmlns:cx="http://schemas.microsoft.com/office/drawing/2014/chartex" xmlns:cx1="http://schemas.microsoft.com/office/drawing/2015/9/8/chartex" xmlns:mc="http://schemas.openxmlformats.org/markup-compatibility/2006" xmlns:o="urn:schemas-microsoft-com:office:office" xmlns:r="http://schemas.openxmlformats.org/officeDocument/2006/relationships" xmlns:m="http://schemas.openxmlformats.org/officeDocument/2006/math" xmlns:v="urn:schemas-microsoft-com:vml" xmlns:wp14="http://schemas.microsoft.com/office/word/2010/wordprocessingDrawing" xmlns:wp="http://schemas.openxmlformats.org/drawingml/2006/wordprocessingDrawing" xmlns:w10="urn:schemas-microsoft-com:office:word" xmlns:w="http://schemas.openxmlformats.org/wordprocessingml/2006/main" xmlns:w14="http://schemas.microsoft.com/office/word/2010/wordml" xmlns:w15="http://schemas.microsoft.com/office/word/2012/wordml" xmlns:w16se="http://schemas.microsoft.com/office/word/2015/wordml/symex" xmlns:wpg="http://schemas.microsoft.com/office/word/2010/wordprocessingGroup" xmlns:wpi="http://schemas.microsoft.com/office/word/2010/wordprocessingInk" xmlns:wne="http://schemas.microsoft.com/office/word/2006/wordml" xmlns:wps="http://schemas.microsoft.com/office/word/2010/wordprocessingShape" mc:Ignorable="w14 w15 w16se wp14">
   <w:abstractNum w:abstractNumId="0" w15:restartNumberingAfterBreak="0">
-    <w:nsid w:val="6355055B"/>
+    <w:nsid w:val="47251F40"/>
     <w:multiLevelType w:val="hybridMultilevel"/>
-    <w:tmpl w:val="338CF86A"/>
-    <w:lvl w:ilvl="0" w:tplc="BC488684">
+    <w:tmpl w:val="30269A32"/>
+    <w:lvl w:ilvl="0" w:tplc="1E0AD336">
       <w:start w:val="1"/>
       <w:numFmt w:val="bullet"/>
       <w:lvlText w:val="●"/>
@@ -5896,7 +5930,7 @@
         <w:ind w:left="720" w:hanging="360"/>
       </w:pPr>
     </w:lvl>
-    <w:lvl w:ilvl="1" w:tplc="12500EE6">
+    <w:lvl w:ilvl="1" w:tplc="4B74237E">
       <w:start w:val="1"/>
       <w:numFmt w:val="bullet"/>
       <w:lvlText w:val="○"/>
@@ -5905,7 +5939,7 @@
         <w:ind w:left="1440" w:hanging="360"/>
       </w:pPr>
     </w:lvl>
-    <w:lvl w:ilvl="2" w:tplc="DE3C1F16">
+    <w:lvl w:ilvl="2" w:tplc="008E89A6">
       <w:start w:val="1"/>
       <w:numFmt w:val="bullet"/>
       <w:lvlText w:val="■"/>
@@ -5914,7 +5948,7 @@
         <w:ind w:left="2160" w:hanging="360"/>
       </w:pPr>
     </w:lvl>
-    <w:lvl w:ilvl="3" w:tplc="19202E60">
+    <w:lvl w:ilvl="3" w:tplc="3A7E7E42">
       <w:start w:val="1"/>
       <w:numFmt w:val="bullet"/>
       <w:lvlText w:val="●"/>
@@ -5923,7 +5957,7 @@
         <w:ind w:left="2880" w:hanging="360"/>
       </w:pPr>
     </w:lvl>
-    <w:lvl w:ilvl="4" w:tplc="8A72ABD2">
+    <w:lvl w:ilvl="4" w:tplc="2790146E">
       <w:start w:val="1"/>
       <w:numFmt w:val="bullet"/>
       <w:lvlText w:val="○"/>
@@ -5932,7 +5966,7 @@
         <w:ind w:left="3600" w:hanging="360"/>
       </w:pPr>
     </w:lvl>
-    <w:lvl w:ilvl="5" w:tplc="284A0558">
+    <w:lvl w:ilvl="5" w:tplc="4738C252">
       <w:start w:val="1"/>
       <w:numFmt w:val="bullet"/>
       <w:lvlText w:val="■"/>
@@ -5941,7 +5975,7 @@
         <w:ind w:left="4320" w:hanging="360"/>
       </w:pPr>
     </w:lvl>
-    <w:lvl w:ilvl="6" w:tplc="62C0FCF8">
+    <w:lvl w:ilvl="6" w:tplc="77427E24">
       <w:start w:val="1"/>
       <w:numFmt w:val="bullet"/>
       <w:lvlText w:val="●"/>
@@ -5950,7 +5984,7 @@
         <w:ind w:left="5040" w:hanging="360"/>
       </w:pPr>
     </w:lvl>
-    <w:lvl w:ilvl="7" w:tplc="392A7E04">
+    <w:lvl w:ilvl="7" w:tplc="B8CE34B0">
       <w:start w:val="1"/>
       <w:numFmt w:val="bullet"/>
       <w:lvlText w:val="●"/>
@@ -5959,7 +5993,7 @@
         <w:ind w:left="5760" w:hanging="360"/>
       </w:pPr>
     </w:lvl>
-    <w:lvl w:ilvl="8" w:tplc="C528490A">
+    <w:lvl w:ilvl="8" w:tplc="9F447EE8">
       <w:start w:val="1"/>
       <w:numFmt w:val="bullet"/>
       <w:lvlText w:val="●"/>

</xml_diff>